<commit_message>
rename diploma to certificate
</commit_message>
<xml_diff>
--- a/web/src/main/resources/org/openurp/std/info/majorDegreeDoc.docx
+++ b/web/src/main/resources/org/openurp/std/info/majorDegreeDoc.docx
@@ -18,7 +18,7 @@
           <w:rFonts w:ascii="宋体" w:hAnsi="宋体"/>
         </w:rPr>
         <w:drawing>
-          <wp:anchor distT="0" distB="0" distL="114300" distR="114300" simplePos="0" relativeHeight="251660288" behindDoc="1" locked="0" layoutInCell="1" allowOverlap="1">
+          <wp:anchor distT="0" distB="0" distL="114300" distR="114300" simplePos="0" relativeHeight="251659264" behindDoc="1" locked="0" layoutInCell="1" allowOverlap="1">
             <wp:simplePos x="0" y="0"/>
             <wp:positionH relativeFrom="column">
               <wp:posOffset>-895985</wp:posOffset>
@@ -31,7 +31,7 @@
             <wp:wrapNone/>
             <wp:docPr id="1" name="图片 7" descr="Page0001"/>
             <wp:cNvGraphicFramePr>
-              <a:graphicFrameLocks xmlns:a="http://schemas.openxmlformats.org/drawingml/2006/main" noChangeAspect="true"/>
+              <a:graphicFrameLocks xmlns:a="http://schemas.openxmlformats.org/drawingml/2006/main" noChangeAspect="1"/>
             </wp:cNvGraphicFramePr>
             <a:graphic xmlns:a="http://schemas.openxmlformats.org/drawingml/2006/main">
               <a:graphicData uri="http://schemas.openxmlformats.org/drawingml/2006/picture">
@@ -39,7 +39,7 @@
                   <pic:nvPicPr>
                     <pic:cNvPr id="1" name="图片 7" descr="Page0001"/>
                     <pic:cNvPicPr>
-                      <a:picLocks noChangeAspect="true"/>
+                      <a:picLocks noChangeAspect="1"/>
                     </pic:cNvPicPr>
                   </pic:nvPicPr>
                   <pic:blipFill>
@@ -571,10 +571,20 @@
           <w:szCs w:val="28"/>
           <w:lang w:val="en-US" w:eastAsia="zh-CN"/>
         </w:rPr>
-        <w:t xml:space="preserve">  </w:t>
+        <w:t xml:space="preserve"> </w:t>
       </w:r>
       <w:bookmarkStart w:id="0" w:name="_GoBack"/>
       <w:bookmarkEnd w:id="0"/>
+      <w:r>
+        <w:rPr>
+          <w:rFonts w:hint="eastAsia" w:eastAsia="楷体_GB2312"/>
+          <w:b/>
+          <w:sz w:val="28"/>
+          <w:szCs w:val="28"/>
+          <w:lang w:val="en-US" w:eastAsia="zh-CN"/>
+        </w:rPr>
+        <w:t xml:space="preserve">  </w:t>
+      </w:r>
       <w:r>
         <w:rPr>
           <w:rFonts w:hint="eastAsia" w:eastAsia="楷体_GB2312"/>
@@ -617,6 +627,7 @@
         <w:rFonts w:ascii="Times New Roman" w:hAnsi="Times New Roman" w:eastAsia="宋体" w:cs="Times New Roman"/>
       </w:rPr>
     </w:rPrDefault>
+    <w:pPrDefault/>
   </w:docDefaults>
   <w:latentStyles w:count="260" w:defQFormat="0" w:defUnhideWhenUsed="1" w:defSemiHidden="1" w:defUIPriority="99" w:defLockedState="0">
     <w:lsdException w:qFormat="1" w:unhideWhenUsed="0" w:uiPriority="0" w:semiHidden="0" w:name="Normal"/>
@@ -1094,7 +1105,7 @@
         <a:solidFill>
           <a:schemeClr val="phClr"/>
         </a:solidFill>
-        <a:gradFill rotWithShape="true">
+        <a:gradFill rotWithShape="1">
           <a:gsLst>
             <a:gs pos="0">
               <a:schemeClr val="phClr">
@@ -1115,9 +1126,9 @@
               </a:schemeClr>
             </a:gs>
           </a:gsLst>
-          <a:lin ang="16200000" scaled="true"/>
+          <a:lin ang="16200000" scaled="1"/>
         </a:gradFill>
-        <a:gradFill rotWithShape="true">
+        <a:gradFill rotWithShape="1">
           <a:gsLst>
             <a:gs pos="0">
               <a:schemeClr val="phClr">
@@ -1138,7 +1149,7 @@
               </a:schemeClr>
             </a:gs>
           </a:gsLst>
-          <a:lin ang="16200000" scaled="false"/>
+          <a:lin ang="16200000" scaled="0"/>
         </a:gradFill>
       </a:fillStyleLst>
       <a:lnStyleLst>
@@ -1208,7 +1219,7 @@
         <a:solidFill>
           <a:schemeClr val="phClr"/>
         </a:solidFill>
-        <a:gradFill rotWithShape="true">
+        <a:gradFill rotWithShape="1">
           <a:gsLst>
             <a:gs pos="0">
               <a:schemeClr val="phClr">
@@ -1234,7 +1245,7 @@
             <a:fillToRect l="50000" t="-80000" r="50000" b="180000"/>
           </a:path>
         </a:gradFill>
-        <a:gradFill rotWithShape="true">
+        <a:gradFill rotWithShape="1">
           <a:gsLst>
             <a:gs pos="0">
               <a:schemeClr val="phClr">
@@ -1258,20 +1269,4 @@
   </a:themeElements>
   <a:objectDefaults/>
 </a:theme>
-</file>
-
-<file path=customXml/item1.xml><?xml version="1.0" encoding="utf-8"?>
-<s:customData xmlns="http://www.wps.cn/officeDocument/2013/wpsCustomData" xmlns:s="http://www.wps.cn/officeDocument/2013/wpsCustomData">
-  <customSectProps>
-    <customSectPr/>
-  </customSectProps>
-</s:customData>
-</file>
-
-<file path=customXml/itemProps1.xml><?xml version="1.0" encoding="utf-8"?>
-<ds:datastoreItem xmlns:ds="http://schemas.openxmlformats.org/officeDocument/2006/customXml" ds:itemID="{B1977F7D-205B-4081-913C-38D41E755F92}">
-  <ds:schemaRefs>
-    <ds:schemaRef ds:uri="http://www.wps.cn/officeDocument/2013/wpsCustomData"/>
-  </ds:schemaRefs>
-</ds:datastoreItem>
 </file>
</xml_diff>